<commit_message>
Continuacion de la memoria
</commit_message>
<xml_diff>
--- a/memoria/memoria.docx
+++ b/memoria/memoria.docx
@@ -77,43 +77,7 @@
           <w:sz w:val="28"/>
           <w:szCs w:val="28"/>
         </w:rPr>
-        <w:t xml:space="preserve">Este proyecto consiste en la creación de una </w:t>
-      </w:r>
-      <w:r>
-        <w:rPr>
-          <w:rFonts w:ascii="Arial" w:hAnsi="Arial" w:cs="Arial"/>
-          <w:b/>
-          <w:bCs/>
-          <w:sz w:val="28"/>
-          <w:szCs w:val="28"/>
-        </w:rPr>
-        <w:t>pieza audiovisual narrativa</w:t>
-      </w:r>
-      <w:r>
-        <w:rPr>
-          <w:rFonts w:ascii="Arial" w:hAnsi="Arial" w:cs="Arial"/>
-          <w:sz w:val="28"/>
-          <w:szCs w:val="28"/>
-        </w:rPr>
-        <w:t xml:space="preserve"> y una </w:t>
-      </w:r>
-      <w:r>
-        <w:rPr>
-          <w:rFonts w:ascii="Arial" w:hAnsi="Arial" w:cs="Arial"/>
-          <w:b/>
-          <w:bCs/>
-          <w:sz w:val="28"/>
-          <w:szCs w:val="28"/>
-        </w:rPr>
-        <w:t>plataforma web interactiva</w:t>
-      </w:r>
-      <w:r>
-        <w:rPr>
-          <w:rFonts w:ascii="Arial" w:hAnsi="Arial" w:cs="Arial"/>
-          <w:sz w:val="28"/>
-          <w:szCs w:val="28"/>
-        </w:rPr>
-        <w:t xml:space="preserve"> sobre la Batalla de las Navas de Tolosa. El objetivo es divulgar este hito histórico combinando el rigor documental con técnicas de narrativa digital (storytelling).</w:t>
+        <w:t>En este proyecto nos hemos centrado en la creación de una pieza audiovisual narrativa y una plataforma web interactiva sobre la Batalla de las Navas de Tolosa con el objetivo de exponerlo en el museo de las Navas de Tolosa de Jaén, usando la veracidad histórica y la IA generativa.</w:t>
       </w:r>
     </w:p>
     <w:p>
@@ -191,8 +155,53 @@
           <w:sz w:val="28"/>
           <w:szCs w:val="28"/>
         </w:rPr>
-        <w:t xml:space="preserve"> Elaboración de un informe detallado sobre el contexto de la Reconquista en el siglo XIII.</w:t>
-      </w:r>
+        <w:t xml:space="preserve"> </w:t>
+      </w:r>
+      <w:r>
+        <w:rPr>
+          <w:rFonts w:ascii="Arial" w:hAnsi="Arial" w:cs="Arial"/>
+          <w:sz w:val="28"/>
+          <w:szCs w:val="28"/>
+        </w:rPr>
+        <w:t>Elaboración de un extenso informe detallado, con datos históricos coherentes y verificados tras una investigación profunda en diversas páginas web para una mejor realidad del video.</w:t>
+      </w:r>
+    </w:p>
+    <w:p>
+      <w:pPr>
+        <w:spacing w:after="0" w:line="240" w:lineRule="auto"/>
+        <w:rPr>
+          <w:rFonts w:ascii="Times New Roman" w:eastAsia="Times New Roman" w:hAnsi="Times New Roman" w:cs="Times New Roman"/>
+          <w:kern w:val="0"/>
+          <w:sz w:val="24"/>
+          <w:szCs w:val="24"/>
+          <w:lang w:eastAsia="es-ES"/>
+          <w14:ligatures w14:val="none"/>
+        </w:rPr>
+      </w:pPr>
+      <w:hyperlink r:id="rId5" w:history="1">
+        <w:r>
+          <w:rPr>
+            <w:rFonts w:ascii="Times New Roman" w:eastAsia="Times New Roman" w:hAnsi="Times New Roman" w:cs="Times New Roman"/>
+            <w:color w:val="0000FF"/>
+            <w:kern w:val="0"/>
+            <w:sz w:val="24"/>
+            <w:szCs w:val="24"/>
+            <w:u w:val="single"/>
+            <w:lang w:eastAsia="es-ES"/>
+            <w14:ligatures w14:val="none"/>
+          </w:rPr>
+          <w:t>Informe De Investigación.pdf</w:t>
+        </w:r>
+      </w:hyperlink>
+    </w:p>
+    <w:p>
+      <w:pPr>
+        <w:rPr>
+          <w:rFonts w:ascii="Arial" w:hAnsi="Arial" w:cs="Arial"/>
+          <w:sz w:val="28"/>
+          <w:szCs w:val="28"/>
+        </w:rPr>
+      </w:pPr>
     </w:p>
     <w:p>
       <w:pPr>
@@ -222,8 +231,53 @@
           <w:sz w:val="28"/>
           <w:szCs w:val="28"/>
         </w:rPr>
-        <w:t xml:space="preserve"> Sesiones creativas para decidir el tono del vídeo (épico/narrativo) y los puntos clave de la web.</w:t>
-      </w:r>
+        <w:t xml:space="preserve"> </w:t>
+      </w:r>
+      <w:r>
+        <w:rPr>
+          <w:rFonts w:ascii="Arial" w:hAnsi="Arial" w:cs="Arial"/>
+          <w:sz w:val="28"/>
+          <w:szCs w:val="28"/>
+        </w:rPr>
+        <w:t>Breve documento para la redacción de ideas para el desarrollo del proyecto</w:t>
+      </w:r>
+    </w:p>
+    <w:p>
+      <w:pPr>
+        <w:spacing w:after="0" w:line="240" w:lineRule="auto"/>
+        <w:rPr>
+          <w:rFonts w:ascii="Times New Roman" w:eastAsia="Times New Roman" w:hAnsi="Times New Roman" w:cs="Times New Roman"/>
+          <w:kern w:val="0"/>
+          <w:sz w:val="24"/>
+          <w:szCs w:val="24"/>
+          <w:lang w:eastAsia="es-ES"/>
+          <w14:ligatures w14:val="none"/>
+        </w:rPr>
+      </w:pPr>
+      <w:hyperlink r:id="rId6" w:history="1">
+        <w:r>
+          <w:rPr>
+            <w:rFonts w:ascii="Times New Roman" w:eastAsia="Times New Roman" w:hAnsi="Times New Roman" w:cs="Times New Roman"/>
+            <w:color w:val="0000FF"/>
+            <w:kern w:val="0"/>
+            <w:sz w:val="24"/>
+            <w:szCs w:val="24"/>
+            <w:u w:val="single"/>
+            <w:lang w:eastAsia="es-ES"/>
+            <w14:ligatures w14:val="none"/>
+          </w:rPr>
+          <w:t>Informe Lluvia de Ideas.pdf</w:t>
+        </w:r>
+      </w:hyperlink>
+    </w:p>
+    <w:p>
+      <w:pPr>
+        <w:rPr>
+          <w:rFonts w:ascii="Arial" w:hAnsi="Arial" w:cs="Arial"/>
+          <w:sz w:val="28"/>
+          <w:szCs w:val="28"/>
+        </w:rPr>
+      </w:pPr>
     </w:p>
     <w:p>
       <w:pPr>
@@ -253,36 +307,111 @@
           <w:sz w:val="28"/>
           <w:szCs w:val="28"/>
         </w:rPr>
-        <w:t xml:space="preserve"> Redacción de un guion completo con el desglose de todas las escenas, diálogos del narrador (Hernando) y acciones de los personajes.</w:t>
-      </w:r>
-    </w:p>
-    <w:p>
-      <w:pPr>
-        <w:rPr>
-          <w:rFonts w:ascii="Arial" w:hAnsi="Arial" w:cs="Arial"/>
-          <w:sz w:val="28"/>
-          <w:szCs w:val="28"/>
-        </w:rPr>
-      </w:pPr>
-    </w:p>
-    <w:p>
-      <w:pPr>
-        <w:rPr>
-          <w:rFonts w:ascii="Arial" w:hAnsi="Arial" w:cs="Arial"/>
-          <w:b/>
-          <w:bCs/>
-          <w:sz w:val="28"/>
-          <w:szCs w:val="28"/>
-        </w:rPr>
-      </w:pPr>
-      <w:r>
-        <w:rPr>
-          <w:rFonts w:ascii="Arial" w:hAnsi="Arial" w:cs="Arial"/>
-          <w:b/>
-          <w:bCs/>
-          <w:sz w:val="28"/>
-          <w:szCs w:val="28"/>
-        </w:rPr>
+        <w:t xml:space="preserve"> Redacción de un guion completo co</w:t>
+      </w:r>
+      <w:r>
+        <w:rPr>
+          <w:rFonts w:ascii="Arial" w:hAnsi="Arial" w:cs="Arial"/>
+          <w:sz w:val="28"/>
+          <w:szCs w:val="28"/>
+        </w:rPr>
+        <w:t>n la descripción detallada de las escenas, los sentimientos de los personajes, la manera en la que lucen en determinadas escenas, acciones que realizan y diálogos completos</w:t>
+      </w:r>
+    </w:p>
+    <w:p>
+      <w:pPr>
+        <w:spacing w:after="0" w:line="240" w:lineRule="auto"/>
+        <w:rPr>
+          <w:rFonts w:ascii="Times New Roman" w:eastAsia="Times New Roman" w:hAnsi="Times New Roman" w:cs="Times New Roman"/>
+          <w:kern w:val="0"/>
+          <w:sz w:val="24"/>
+          <w:szCs w:val="24"/>
+          <w:lang w:eastAsia="es-ES"/>
+          <w14:ligatures w14:val="none"/>
+        </w:rPr>
+      </w:pPr>
+      <w:hyperlink r:id="rId7" w:history="1">
+        <w:r>
+          <w:rPr>
+            <w:rFonts w:ascii="Times New Roman" w:eastAsia="Times New Roman" w:hAnsi="Times New Roman" w:cs="Times New Roman"/>
+            <w:color w:val="0000FF"/>
+            <w:kern w:val="0"/>
+            <w:sz w:val="24"/>
+            <w:szCs w:val="24"/>
+            <w:u w:val="single"/>
+            <w:lang w:eastAsia="es-ES"/>
+            <w14:ligatures w14:val="none"/>
+          </w:rPr>
+          <w:t>Guión.pdf</w:t>
+        </w:r>
+      </w:hyperlink>
+    </w:p>
+    <w:p>
+      <w:pPr>
+        <w:ind w:left="720"/>
+        <w:rPr>
+          <w:rFonts w:ascii="Arial" w:hAnsi="Arial" w:cs="Arial"/>
+          <w:sz w:val="28"/>
+          <w:szCs w:val="28"/>
+        </w:rPr>
+      </w:pPr>
+    </w:p>
+    <w:p>
+      <w:pPr>
+        <w:ind w:left="720"/>
+        <w:rPr>
+          <w:rFonts w:ascii="Arial" w:hAnsi="Arial" w:cs="Arial"/>
+          <w:sz w:val="28"/>
+          <w:szCs w:val="28"/>
+        </w:rPr>
+      </w:pPr>
+    </w:p>
+    <w:p>
+      <w:pPr>
+        <w:rPr>
+          <w:rFonts w:ascii="Arial" w:hAnsi="Arial" w:cs="Arial"/>
+          <w:sz w:val="28"/>
+          <w:szCs w:val="28"/>
+        </w:rPr>
+      </w:pPr>
+    </w:p>
+    <w:p>
+      <w:pPr>
+        <w:rPr>
+          <w:rFonts w:ascii="Arial" w:hAnsi="Arial" w:cs="Arial"/>
+          <w:sz w:val="28"/>
+          <w:szCs w:val="28"/>
+        </w:rPr>
+      </w:pPr>
+    </w:p>
+    <w:p>
+      <w:pPr>
+        <w:rPr>
+          <w:rFonts w:ascii="Arial" w:hAnsi="Arial" w:cs="Arial"/>
+          <w:sz w:val="28"/>
+          <w:szCs w:val="28"/>
+        </w:rPr>
+      </w:pPr>
+    </w:p>
+    <w:p>
+      <w:pPr>
+        <w:rPr>
+          <w:rFonts w:ascii="Arial" w:hAnsi="Arial" w:cs="Arial"/>
+          <w:b/>
+          <w:bCs/>
+          <w:sz w:val="28"/>
+          <w:szCs w:val="28"/>
+        </w:rPr>
+      </w:pPr>
+      <w:r>
+        <w:rPr>
+          <w:rFonts w:ascii="Arial" w:hAnsi="Arial" w:cs="Arial"/>
+          <w:b/>
+          <w:bCs/>
+          <w:sz w:val="28"/>
+          <w:szCs w:val="28"/>
+        </w:rPr>
+        <w:lastRenderedPageBreak/>
         <w:t xml:space="preserve">3. Gestión de Activos y Recursos </w:t>
       </w:r>
     </w:p>
@@ -300,117 +429,399 @@
           <w:sz w:val="28"/>
           <w:szCs w:val="28"/>
         </w:rPr>
-        <w:t>Para una producción eficiente, hemos organizado el material en una estructura de directorios optimizada:</w:t>
-      </w:r>
-    </w:p>
-    <w:p>
-      <w:pPr>
-        <w:rPr>
-          <w:rFonts w:ascii="Arial" w:hAnsi="Arial" w:cs="Arial"/>
-          <w:b/>
-          <w:bCs/>
-          <w:sz w:val="28"/>
-          <w:szCs w:val="28"/>
-        </w:rPr>
-      </w:pPr>
-      <w:r>
-        <w:rPr>
-          <w:rFonts w:ascii="Arial" w:hAnsi="Arial" w:cs="Arial"/>
-          <w:b/>
-          <w:bCs/>
-          <w:sz w:val="28"/>
-          <w:szCs w:val="28"/>
-        </w:rPr>
-        <w:t>A. Personajes y Elenco</w:t>
-      </w:r>
-    </w:p>
-    <w:p>
-      <w:pPr>
-        <w:rPr>
-          <w:rFonts w:ascii="Arial" w:hAnsi="Arial" w:cs="Arial"/>
-          <w:sz w:val="28"/>
-          <w:szCs w:val="28"/>
-        </w:rPr>
-      </w:pPr>
-      <w:r>
-        <w:rPr>
-          <w:rFonts w:ascii="Arial" w:hAnsi="Arial" w:cs="Arial"/>
-          <w:sz w:val="28"/>
-          <w:szCs w:val="28"/>
-        </w:rPr>
-        <w:t>Contamos con una galería completa de personajes que representan ambos bandos y la vida civil:</w:t>
-      </w:r>
-    </w:p>
-    <w:p>
-      <w:pPr>
-        <w:numPr>
-          <w:ilvl w:val="0"/>
-          <w:numId w:val="2"/>
-        </w:numPr>
-        <w:rPr>
-          <w:rFonts w:ascii="Arial" w:hAnsi="Arial" w:cs="Arial"/>
-          <w:sz w:val="28"/>
-          <w:szCs w:val="28"/>
-        </w:rPr>
-      </w:pPr>
-      <w:r>
-        <w:rPr>
-          <w:rFonts w:ascii="Arial" w:hAnsi="Arial" w:cs="Arial"/>
-          <w:b/>
-          <w:bCs/>
-          <w:sz w:val="28"/>
-          <w:szCs w:val="28"/>
-        </w:rPr>
-        <w:t>Líderes Históricos:</w:t>
-      </w:r>
-      <w:r>
-        <w:rPr>
-          <w:rFonts w:ascii="Arial" w:hAnsi="Arial" w:cs="Arial"/>
-          <w:sz w:val="28"/>
-          <w:szCs w:val="28"/>
-        </w:rPr>
-        <w:t xml:space="preserve"> Alfonso VIII, Pedro II, Sancho VII y Muhammad al-Nasir.</w:t>
-      </w:r>
-    </w:p>
-    <w:p>
-      <w:pPr>
-        <w:numPr>
-          <w:ilvl w:val="0"/>
-          <w:numId w:val="2"/>
-        </w:numPr>
-        <w:rPr>
-          <w:rFonts w:ascii="Arial" w:hAnsi="Arial" w:cs="Arial"/>
-          <w:sz w:val="28"/>
-          <w:szCs w:val="28"/>
-        </w:rPr>
-      </w:pPr>
-      <w:r>
-        <w:rPr>
-          <w:rFonts w:ascii="Arial" w:hAnsi="Arial" w:cs="Arial"/>
-          <w:b/>
-          <w:bCs/>
-          <w:sz w:val="28"/>
-          <w:szCs w:val="28"/>
-        </w:rPr>
-        <w:t>Ficción Narrativa:</w:t>
-      </w:r>
-      <w:r>
-        <w:rPr>
-          <w:rFonts w:ascii="Arial" w:hAnsi="Arial" w:cs="Arial"/>
-          <w:sz w:val="28"/>
-          <w:szCs w:val="28"/>
-        </w:rPr>
-        <w:t xml:space="preserve"> Rodrigo (protagonista), Pascasia (esposa), Fernando (hijo) y soldados como Esteban y Bautista.</w:t>
-      </w:r>
-    </w:p>
-    <w:p>
-      <w:pPr>
-        <w:numPr>
-          <w:ilvl w:val="0"/>
-          <w:numId w:val="2"/>
-        </w:numPr>
-        <w:rPr>
-          <w:rFonts w:ascii="Arial" w:hAnsi="Arial" w:cs="Arial"/>
+        <w:t>Para una organización clara y concisa, dividimos el repositorio de GitHub en subcarpetas con los contenidos relacionados en el interior</w:t>
+      </w:r>
+    </w:p>
+    <w:p>
+      <w:pPr>
+        <w:rPr>
+          <w:rFonts w:ascii="Arial" w:hAnsi="Arial" w:cs="Arial"/>
+          <w:sz w:val="28"/>
+          <w:szCs w:val="28"/>
+        </w:rPr>
+      </w:pPr>
+      <w:hyperlink r:id="rId8" w:history="1">
+        <w:r>
+          <w:rPr>
+            <w:rStyle w:val="Hipervnculo"/>
+            <w:rFonts w:ascii="Arial" w:hAnsi="Arial" w:cs="Arial"/>
+            <w:sz w:val="28"/>
+            <w:szCs w:val="28"/>
+          </w:rPr>
+          <w:t>https://github.com/horseantonio84/jen-estancias</w:t>
+        </w:r>
+      </w:hyperlink>
+    </w:p>
+    <w:p>
+      <w:pPr>
+        <w:rPr>
+          <w:rFonts w:ascii="Arial" w:hAnsi="Arial" w:cs="Arial"/>
+          <w:sz w:val="28"/>
+          <w:szCs w:val="28"/>
+        </w:rPr>
+      </w:pPr>
+    </w:p>
+    <w:p>
+      <w:pPr>
+        <w:rPr>
+          <w:rFonts w:ascii="Arial" w:hAnsi="Arial" w:cs="Arial"/>
+          <w:b/>
+          <w:bCs/>
+          <w:sz w:val="28"/>
+          <w:szCs w:val="28"/>
+        </w:rPr>
+      </w:pPr>
+      <w:r>
+        <w:rPr>
+          <w:rFonts w:ascii="Arial" w:hAnsi="Arial" w:cs="Arial"/>
+          <w:b/>
+          <w:bCs/>
+          <w:sz w:val="28"/>
+          <w:szCs w:val="28"/>
+        </w:rPr>
+        <w:t xml:space="preserve">A. </w:t>
+      </w:r>
+      <w:r>
+        <w:rPr>
+          <w:rFonts w:ascii="Arial" w:hAnsi="Arial" w:cs="Arial"/>
+          <w:b/>
+          <w:bCs/>
+          <w:sz w:val="28"/>
+          <w:szCs w:val="28"/>
+        </w:rPr>
+        <w:t>Guion</w:t>
+      </w:r>
+    </w:p>
+    <w:p>
+      <w:pPr>
+        <w:rPr>
+          <w:rFonts w:ascii="Arial" w:hAnsi="Arial" w:cs="Arial"/>
+          <w:sz w:val="28"/>
+          <w:szCs w:val="28"/>
+        </w:rPr>
+      </w:pPr>
+      <w:r>
+        <w:rPr>
+          <w:rFonts w:ascii="Arial" w:hAnsi="Arial" w:cs="Arial"/>
+          <w:b/>
+          <w:bCs/>
+          <w:sz w:val="28"/>
+          <w:szCs w:val="28"/>
+        </w:rPr>
+        <w:tab/>
+      </w:r>
+      <w:r>
+        <w:rPr>
+          <w:rFonts w:ascii="Arial" w:hAnsi="Arial" w:cs="Arial"/>
+          <w:sz w:val="28"/>
+          <w:szCs w:val="28"/>
+        </w:rPr>
+        <w:t>En esta carpeta se puede encontrar el guion completo</w:t>
+      </w:r>
+    </w:p>
+    <w:p>
+      <w:pPr>
+        <w:rPr>
+          <w:rFonts w:ascii="Arial" w:hAnsi="Arial" w:cs="Arial"/>
+          <w:b/>
+          <w:bCs/>
+          <w:sz w:val="28"/>
+          <w:szCs w:val="28"/>
+        </w:rPr>
+      </w:pPr>
+      <w:r>
+        <w:rPr>
+          <w:rFonts w:ascii="Arial" w:hAnsi="Arial" w:cs="Arial"/>
+          <w:b/>
+          <w:bCs/>
+          <w:sz w:val="28"/>
+          <w:szCs w:val="28"/>
+        </w:rPr>
+        <w:t xml:space="preserve">B. </w:t>
+      </w:r>
+      <w:r>
+        <w:rPr>
+          <w:rFonts w:ascii="Arial" w:hAnsi="Arial" w:cs="Arial"/>
+          <w:b/>
+          <w:bCs/>
+          <w:sz w:val="28"/>
+          <w:szCs w:val="28"/>
+        </w:rPr>
+        <w:t>Memoria</w:t>
+      </w:r>
+    </w:p>
+    <w:p>
+      <w:pPr>
+        <w:rPr>
+          <w:rFonts w:ascii="Arial" w:hAnsi="Arial" w:cs="Arial"/>
+          <w:sz w:val="28"/>
+          <w:szCs w:val="28"/>
+        </w:rPr>
+      </w:pPr>
+      <w:r>
+        <w:rPr>
+          <w:rFonts w:ascii="Arial" w:hAnsi="Arial" w:cs="Arial"/>
+          <w:sz w:val="28"/>
+          <w:szCs w:val="28"/>
+        </w:rPr>
+        <w:tab/>
+        <w:t>En esta carpeta se haya esta misma memoria</w:t>
+      </w:r>
+    </w:p>
+    <w:p>
+      <w:pPr>
+        <w:rPr>
+          <w:rFonts w:ascii="Arial" w:hAnsi="Arial" w:cs="Arial"/>
+          <w:b/>
+          <w:bCs/>
+          <w:sz w:val="28"/>
+          <w:szCs w:val="28"/>
+        </w:rPr>
+      </w:pPr>
+      <w:r>
+        <w:rPr>
+          <w:rFonts w:ascii="Arial" w:hAnsi="Arial" w:cs="Arial"/>
+          <w:b/>
+          <w:bCs/>
+          <w:sz w:val="28"/>
+          <w:szCs w:val="28"/>
+        </w:rPr>
+        <w:t>C.</w:t>
+      </w:r>
+      <w:r>
+        <w:rPr>
+          <w:rFonts w:ascii="Arial" w:hAnsi="Arial" w:cs="Arial"/>
+          <w:b/>
+          <w:bCs/>
+          <w:sz w:val="28"/>
+          <w:szCs w:val="28"/>
+        </w:rPr>
+        <w:t xml:space="preserve"> Pagina_web</w:t>
+      </w:r>
+    </w:p>
+    <w:p>
+      <w:pPr>
+        <w:ind w:left="720"/>
+        <w:rPr>
+          <w:rFonts w:ascii="Arial" w:hAnsi="Arial" w:cs="Arial"/>
+          <w:sz w:val="28"/>
+          <w:szCs w:val="28"/>
+        </w:rPr>
+      </w:pPr>
+      <w:r>
+        <w:rPr>
+          <w:rFonts w:ascii="Arial" w:hAnsi="Arial" w:cs="Arial"/>
+          <w:sz w:val="28"/>
+          <w:szCs w:val="28"/>
+        </w:rPr>
+        <w:t>En esta carpeta se encuentra la página web con todo el js, el</w:t>
+      </w:r>
+      <w:r>
+        <w:rPr>
+          <w:rFonts w:ascii="Arial" w:hAnsi="Arial" w:cs="Arial"/>
+          <w:sz w:val="28"/>
+          <w:szCs w:val="28"/>
+        </w:rPr>
+        <w:t xml:space="preserve"> </w:t>
+      </w:r>
+      <w:r>
+        <w:rPr>
+          <w:rFonts w:ascii="Arial" w:hAnsi="Arial" w:cs="Arial"/>
+          <w:sz w:val="28"/>
+          <w:szCs w:val="28"/>
+        </w:rPr>
+        <w:t>css, los recursos de imágenes utilizados y por último el index.</w:t>
+      </w:r>
+    </w:p>
+    <w:p>
+      <w:pPr>
+        <w:rPr>
+          <w:rFonts w:ascii="Arial" w:hAnsi="Arial" w:cs="Arial"/>
+          <w:b/>
+          <w:bCs/>
+          <w:sz w:val="28"/>
+          <w:szCs w:val="28"/>
+        </w:rPr>
+      </w:pPr>
+      <w:r>
+        <w:rPr>
+          <w:rFonts w:ascii="Arial" w:hAnsi="Arial" w:cs="Arial"/>
+          <w:b/>
+          <w:bCs/>
+          <w:sz w:val="28"/>
+          <w:szCs w:val="28"/>
+        </w:rPr>
+        <w:t>D. Recursos_escenas</w:t>
+      </w:r>
+    </w:p>
+    <w:p>
+      <w:pPr>
+        <w:ind w:left="705"/>
+        <w:rPr>
+          <w:rFonts w:ascii="Arial" w:hAnsi="Arial" w:cs="Arial"/>
+          <w:sz w:val="28"/>
+          <w:szCs w:val="28"/>
+        </w:rPr>
+      </w:pPr>
+      <w:r>
+        <w:rPr>
+          <w:rFonts w:ascii="Arial" w:hAnsi="Arial" w:cs="Arial"/>
+          <w:sz w:val="28"/>
+          <w:szCs w:val="28"/>
+        </w:rPr>
+        <w:t>Carpeta con todos los fragmentos generados del video sin unificar, cada uno de ellos está numerado con el número de la escena a la que corresponde y la parte</w:t>
+      </w:r>
+    </w:p>
+    <w:p>
+      <w:pPr>
+        <w:rPr>
+          <w:rFonts w:ascii="Arial" w:hAnsi="Arial" w:cs="Arial"/>
+          <w:b/>
+          <w:bCs/>
+          <w:sz w:val="28"/>
+          <w:szCs w:val="28"/>
+        </w:rPr>
+      </w:pPr>
+      <w:r>
+        <w:rPr>
+          <w:rFonts w:ascii="Arial" w:hAnsi="Arial" w:cs="Arial"/>
+          <w:b/>
+          <w:bCs/>
+          <w:sz w:val="28"/>
+          <w:szCs w:val="28"/>
+        </w:rPr>
+        <w:t>E. Recursos_imagenes</w:t>
+      </w:r>
+    </w:p>
+    <w:p>
+      <w:pPr>
+        <w:ind w:left="705"/>
+        <w:rPr>
+          <w:rFonts w:ascii="Arial" w:hAnsi="Arial" w:cs="Arial"/>
+          <w:sz w:val="28"/>
+          <w:szCs w:val="28"/>
+        </w:rPr>
+      </w:pPr>
+      <w:r>
+        <w:rPr>
+          <w:rFonts w:ascii="Arial" w:hAnsi="Arial" w:cs="Arial"/>
+          <w:sz w:val="28"/>
+          <w:szCs w:val="28"/>
+        </w:rPr>
+        <w:t>En esta se hayan carpetas con las fotos generadas con IA para los escenarios, los objetos, las fotos de perfil, los personajes y los separadores de escena</w:t>
+      </w:r>
+    </w:p>
+    <w:p>
+      <w:pPr>
+        <w:rPr>
+          <w:rFonts w:ascii="Arial" w:hAnsi="Arial" w:cs="Arial"/>
+          <w:b/>
+          <w:bCs/>
+          <w:sz w:val="28"/>
+          <w:szCs w:val="28"/>
+        </w:rPr>
+      </w:pPr>
+      <w:r>
+        <w:rPr>
+          <w:rFonts w:ascii="Arial" w:hAnsi="Arial" w:cs="Arial"/>
+          <w:b/>
+          <w:bCs/>
+          <w:sz w:val="28"/>
+          <w:szCs w:val="28"/>
+        </w:rPr>
+        <w:t>F. Recursos_musica</w:t>
+      </w:r>
+    </w:p>
+    <w:p>
+      <w:pPr>
+        <w:ind w:left="705"/>
+        <w:rPr>
+          <w:rFonts w:ascii="Arial" w:hAnsi="Arial" w:cs="Arial"/>
+          <w:sz w:val="28"/>
+          <w:szCs w:val="28"/>
+        </w:rPr>
+      </w:pPr>
+      <w:r>
+        <w:rPr>
+          <w:rFonts w:ascii="Arial" w:hAnsi="Arial" w:cs="Arial"/>
+          <w:sz w:val="28"/>
+          <w:szCs w:val="28"/>
+        </w:rPr>
+        <w:t>En esta carpeta se encuentran las pistas musicales usadas para el video</w:t>
+      </w:r>
+    </w:p>
+    <w:p>
+      <w:pPr>
+        <w:rPr>
+          <w:rFonts w:ascii="Arial" w:hAnsi="Arial" w:cs="Arial"/>
+          <w:b/>
+          <w:bCs/>
+          <w:sz w:val="28"/>
+          <w:szCs w:val="28"/>
+        </w:rPr>
+      </w:pPr>
+      <w:r>
+        <w:rPr>
+          <w:rFonts w:ascii="Arial" w:hAnsi="Arial" w:cs="Arial"/>
+          <w:b/>
+          <w:bCs/>
+          <w:sz w:val="28"/>
+          <w:szCs w:val="28"/>
+        </w:rPr>
+        <w:t>G. Registro_asistencia</w:t>
+      </w:r>
+    </w:p>
+    <w:p>
+      <w:pPr>
+        <w:ind w:left="705"/>
+        <w:rPr>
+          <w:rFonts w:ascii="Arial" w:hAnsi="Arial" w:cs="Arial"/>
+          <w:sz w:val="28"/>
+          <w:szCs w:val="28"/>
+        </w:rPr>
+      </w:pPr>
+      <w:r>
+        <w:rPr>
+          <w:rFonts w:ascii="Arial" w:hAnsi="Arial" w:cs="Arial"/>
+          <w:sz w:val="28"/>
+          <w:szCs w:val="28"/>
+        </w:rPr>
+        <w:t>Se haya el registro diario de la asistencia de todos los integrantes del grupo</w:t>
+      </w:r>
+    </w:p>
+    <w:p>
+      <w:pPr>
+        <w:rPr>
+          <w:rFonts w:ascii="Arial" w:hAnsi="Arial" w:cs="Arial"/>
+          <w:sz w:val="28"/>
+          <w:szCs w:val="28"/>
+        </w:rPr>
+      </w:pPr>
+    </w:p>
+    <w:p>
+      <w:pPr>
+        <w:rPr>
+          <w:rFonts w:ascii="Arial" w:hAnsi="Arial" w:cs="Arial"/>
+          <w:sz w:val="28"/>
+          <w:szCs w:val="28"/>
+        </w:rPr>
+      </w:pPr>
+    </w:p>
+    <w:p>
+      <w:pPr>
+        <w:rPr>
+          <w:rFonts w:ascii="Arial" w:hAnsi="Arial" w:cs="Arial"/>
+          <w:sz w:val="28"/>
+          <w:szCs w:val="28"/>
+        </w:rPr>
+      </w:pPr>
+    </w:p>
+    <w:p>
+      <w:pPr>
+        <w:rPr>
+          <w:rFonts w:ascii="Arial" w:hAnsi="Arial" w:cs="Arial"/>
+          <w:b/>
+          <w:bCs/>
           <w:sz w:val="28"/>
           <w:szCs w:val="28"/>
         </w:rPr>
@@ -424,238 +835,6 @@
           <w:szCs w:val="28"/>
         </w:rPr>
         <w:lastRenderedPageBreak/>
-        <w:t>Narración:</w:t>
-      </w:r>
-      <w:r>
-        <w:rPr>
-          <w:rFonts w:ascii="Arial" w:hAnsi="Arial" w:cs="Arial"/>
-          <w:sz w:val="28"/>
-          <w:szCs w:val="28"/>
-        </w:rPr>
-        <w:t xml:space="preserve"> Hernando, quien guía el hilo conductor de la historia.</w:t>
-      </w:r>
-    </w:p>
-    <w:p>
-      <w:pPr>
-        <w:rPr>
-          <w:rFonts w:ascii="Arial" w:hAnsi="Arial" w:cs="Arial"/>
-          <w:b/>
-          <w:bCs/>
-          <w:sz w:val="28"/>
-          <w:szCs w:val="28"/>
-        </w:rPr>
-      </w:pPr>
-      <w:r>
-        <w:rPr>
-          <w:rFonts w:ascii="Arial" w:hAnsi="Arial" w:cs="Arial"/>
-          <w:b/>
-          <w:bCs/>
-          <w:sz w:val="28"/>
-          <w:szCs w:val="28"/>
-        </w:rPr>
-        <w:t>B. Escenografía y Objetos</w:t>
-      </w:r>
-    </w:p>
-    <w:p>
-      <w:pPr>
-        <w:numPr>
-          <w:ilvl w:val="0"/>
-          <w:numId w:val="3"/>
-        </w:numPr>
-        <w:rPr>
-          <w:rFonts w:ascii="Arial" w:hAnsi="Arial" w:cs="Arial"/>
-          <w:sz w:val="28"/>
-          <w:szCs w:val="28"/>
-        </w:rPr>
-      </w:pPr>
-      <w:r>
-        <w:rPr>
-          <w:rFonts w:ascii="Arial" w:hAnsi="Arial" w:cs="Arial"/>
-          <w:b/>
-          <w:bCs/>
-          <w:sz w:val="28"/>
-          <w:szCs w:val="28"/>
-        </w:rPr>
-        <w:t>Escenarios:</w:t>
-      </w:r>
-      <w:r>
-        <w:rPr>
-          <w:rFonts w:ascii="Arial" w:hAnsi="Arial" w:cs="Arial"/>
-          <w:sz w:val="28"/>
-          <w:szCs w:val="28"/>
-        </w:rPr>
-        <w:t xml:space="preserve"> Recreaciones visuales de Sierra Morena, el campamento militar, el interior de las casas de la época, poblados y la zona de mando.</w:t>
-      </w:r>
-    </w:p>
-    <w:p>
-      <w:pPr>
-        <w:numPr>
-          <w:ilvl w:val="0"/>
-          <w:numId w:val="3"/>
-        </w:numPr>
-        <w:rPr>
-          <w:rFonts w:ascii="Arial" w:hAnsi="Arial" w:cs="Arial"/>
-          <w:sz w:val="28"/>
-          <w:szCs w:val="28"/>
-        </w:rPr>
-      </w:pPr>
-      <w:r>
-        <w:rPr>
-          <w:rFonts w:ascii="Arial" w:hAnsi="Arial" w:cs="Arial"/>
-          <w:b/>
-          <w:bCs/>
-          <w:sz w:val="28"/>
-          <w:szCs w:val="28"/>
-        </w:rPr>
-        <w:t xml:space="preserve">Objetos </w:t>
-      </w:r>
-      <w:r>
-        <w:rPr>
-          <w:rFonts w:ascii="Arial" w:hAnsi="Arial" w:cs="Arial"/>
-          <w:b/>
-          <w:bCs/>
-          <w:sz w:val="28"/>
-          <w:szCs w:val="28"/>
-        </w:rPr>
-        <w:t>:</w:t>
-      </w:r>
-      <w:r>
-        <w:rPr>
-          <w:rFonts w:ascii="Arial" w:hAnsi="Arial" w:cs="Arial"/>
-          <w:sz w:val="28"/>
-          <w:szCs w:val="28"/>
-        </w:rPr>
-        <w:t xml:space="preserve"> Elementos clave como el </w:t>
-      </w:r>
-      <w:r>
-        <w:rPr>
-          <w:rFonts w:ascii="Arial" w:hAnsi="Arial" w:cs="Arial"/>
-          <w:b/>
-          <w:bCs/>
-          <w:sz w:val="28"/>
-          <w:szCs w:val="28"/>
-        </w:rPr>
-        <w:t>pañuelo</w:t>
-      </w:r>
-      <w:r>
-        <w:rPr>
-          <w:rFonts w:ascii="Arial" w:hAnsi="Arial" w:cs="Arial"/>
-          <w:sz w:val="28"/>
-          <w:szCs w:val="28"/>
-        </w:rPr>
-        <w:t>, que sirve como recurso narrativo o simbólico en el vídeo.</w:t>
-      </w:r>
-    </w:p>
-    <w:p>
-      <w:pPr>
-        <w:rPr>
-          <w:rFonts w:ascii="Arial" w:hAnsi="Arial" w:cs="Arial"/>
-          <w:b/>
-          <w:bCs/>
-          <w:sz w:val="28"/>
-          <w:szCs w:val="28"/>
-        </w:rPr>
-      </w:pPr>
-      <w:r>
-        <w:rPr>
-          <w:rFonts w:ascii="Arial" w:hAnsi="Arial" w:cs="Arial"/>
-          <w:b/>
-          <w:bCs/>
-          <w:sz w:val="28"/>
-          <w:szCs w:val="28"/>
-        </w:rPr>
-        <w:t>C. Recursos Multimedia</w:t>
-      </w:r>
-    </w:p>
-    <w:p>
-      <w:pPr>
-        <w:numPr>
-          <w:ilvl w:val="0"/>
-          <w:numId w:val="4"/>
-        </w:numPr>
-        <w:rPr>
-          <w:rFonts w:ascii="Arial" w:hAnsi="Arial" w:cs="Arial"/>
-          <w:sz w:val="28"/>
-          <w:szCs w:val="28"/>
-        </w:rPr>
-      </w:pPr>
-      <w:r>
-        <w:rPr>
-          <w:rFonts w:ascii="Arial" w:hAnsi="Arial" w:cs="Arial"/>
-          <w:b/>
-          <w:bCs/>
-          <w:sz w:val="28"/>
-          <w:szCs w:val="28"/>
-        </w:rPr>
-        <w:t>Sonido y Música:</w:t>
-      </w:r>
-      <w:r>
-        <w:rPr>
-          <w:rFonts w:ascii="Arial" w:hAnsi="Arial" w:cs="Arial"/>
-          <w:sz w:val="28"/>
-          <w:szCs w:val="28"/>
-        </w:rPr>
-        <w:t xml:space="preserve"> Carpetas independientes con efectos de ambiente (batalla, naturaleza) y una banda sonora épica para reforzar la emoción.</w:t>
-      </w:r>
-    </w:p>
-    <w:p>
-      <w:pPr>
-        <w:numPr>
-          <w:ilvl w:val="0"/>
-          <w:numId w:val="4"/>
-        </w:numPr>
-        <w:rPr>
-          <w:rFonts w:ascii="Arial" w:hAnsi="Arial" w:cs="Arial"/>
-          <w:sz w:val="28"/>
-          <w:szCs w:val="28"/>
-        </w:rPr>
-      </w:pPr>
-      <w:r>
-        <w:rPr>
-          <w:rFonts w:ascii="Arial" w:hAnsi="Arial" w:cs="Arial"/>
-          <w:b/>
-          <w:bCs/>
-          <w:sz w:val="28"/>
-          <w:szCs w:val="28"/>
-        </w:rPr>
-        <w:t>Equipo:</w:t>
-      </w:r>
-      <w:r>
-        <w:rPr>
-          <w:rFonts w:ascii="Arial" w:hAnsi="Arial" w:cs="Arial"/>
-          <w:sz w:val="28"/>
-          <w:szCs w:val="28"/>
-        </w:rPr>
-        <w:t xml:space="preserve"> Carpeta dedicada a los miembros del equipo de producción para la sección "Sobre nosotros" de la web.</w:t>
-      </w:r>
-    </w:p>
-    <w:p>
-      <w:pPr>
-        <w:rPr>
-          <w:rFonts w:ascii="Arial" w:hAnsi="Arial" w:cs="Arial"/>
-          <w:sz w:val="28"/>
-          <w:szCs w:val="28"/>
-        </w:rPr>
-      </w:pPr>
-    </w:p>
-    <w:p>
-      <w:pPr>
-        <w:rPr>
-          <w:rFonts w:ascii="Arial" w:hAnsi="Arial" w:cs="Arial"/>
-          <w:b/>
-          <w:bCs/>
-          <w:sz w:val="28"/>
-          <w:szCs w:val="28"/>
-        </w:rPr>
-      </w:pPr>
-      <w:r>
-        <w:rPr>
-          <w:rFonts w:ascii="Arial" w:hAnsi="Arial" w:cs="Arial"/>
-          <w:b/>
-          <w:bCs/>
-          <w:sz w:val="28"/>
-          <w:szCs w:val="28"/>
-        </w:rPr>
         <w:t>4. Cronología de Trabajo</w:t>
       </w:r>
     </w:p>
@@ -673,7 +852,23 @@
           <w:sz w:val="28"/>
           <w:szCs w:val="28"/>
         </w:rPr>
-        <w:t>El proyecto se ha desarrollado durante tres semanas (Abril 2026), siguiendo este esquema:</w:t>
+        <w:t>El proyecto se ha desarrollado durante tres semana</w:t>
+      </w:r>
+      <w:r>
+        <w:rPr>
+          <w:rFonts w:ascii="Arial" w:hAnsi="Arial" w:cs="Arial"/>
+          <w:sz w:val="28"/>
+          <w:szCs w:val="28"/>
+        </w:rPr>
+        <w:t>s</w:t>
+      </w:r>
+      <w:r>
+        <w:rPr>
+          <w:rFonts w:ascii="Arial" w:hAnsi="Arial" w:cs="Arial"/>
+          <w:sz w:val="28"/>
+          <w:szCs w:val="28"/>
+        </w:rPr>
+        <w:t>, siguiendo este esquema:</w:t>
       </w:r>
     </w:p>
     <w:p>
@@ -2202,6 +2397,7 @@
   <w:style w:type="character" w:default="1" w:styleId="Fuentedeprrafopredeter">
     <w:name w:val="Default Paragraph Font"/>
     <w:uiPriority w:val="1"/>
+    <w:semiHidden/>
     <w:unhideWhenUsed/>
   </w:style>
   <w:style w:type="table" w:default="1" w:styleId="Tablanormal">
@@ -2526,6 +2722,29 @@
       <w:rFonts w:ascii="Times New Roman" w:hAnsi="Times New Roman" w:cs="Times New Roman"/>
       <w:sz w:val="24"/>
       <w:szCs w:val="24"/>
+    </w:rPr>
+  </w:style>
+  <w:style w:type="character" w:styleId="Hipervnculo">
+    <w:name w:val="Hyperlink"/>
+    <w:basedOn w:val="Fuentedeprrafopredeter"/>
+    <w:uiPriority w:val="99"/>
+    <w:unhideWhenUsed/>
+    <w:rsid w:val="00E932C5"/>
+    <w:rPr>
+      <w:color w:val="0000FF"/>
+      <w:u w:val="single"/>
+    </w:rPr>
+  </w:style>
+  <w:style w:type="character" w:styleId="Mencinsinresolver">
+    <w:name w:val="Unresolved Mention"/>
+    <w:basedOn w:val="Fuentedeprrafopredeter"/>
+    <w:uiPriority w:val="99"/>
+    <w:semiHidden/>
+    <w:unhideWhenUsed/>
+    <w:rsid w:val="00E932C5"/>
+    <w:rPr>
+      <w:color w:val="605E5C"/>
+      <w:shd w:val="clear" w:color="auto" w:fill="E1DFDD"/>
     </w:rPr>
   </w:style>
 </w:styles>

</xml_diff>